<commit_message>
fix: Update report document header report
</commit_message>
<xml_diff>
--- a/public/templates/default.docx
+++ b/public/templates/default.docx
@@ -53,8 +53,13 @@
       </w:r>
       <w:proofErr w:type="spellEnd"/>
       <w:r>
-        <w:t xml:space="preserve"> ini</w:t>
-      </w:r>
+        <w:t xml:space="preserve"> </w:t>
+      </w:r>
+      <w:proofErr w:type="spellStart"/>
+      <w:r>
+        <w:t>ini</w:t>
+      </w:r>
+      <w:proofErr w:type="spellEnd"/>
     </w:p>
     <w:p>
       <w:pPr>
@@ -132,7 +137,15 @@
       </w:r>
       <w:proofErr w:type="spellEnd"/>
       <w:r>
-        <w:t xml:space="preserve"> Pihak </w:t>
+        <w:t xml:space="preserve"> </w:t>
+      </w:r>
+      <w:proofErr w:type="spellStart"/>
+      <w:r>
+        <w:t>Pihak</w:t>
+      </w:r>
+      <w:proofErr w:type="spellEnd"/>
+      <w:r>
+        <w:t xml:space="preserve"> </w:t>
       </w:r>
       <w:proofErr w:type="spellStart"/>
       <w:r>
@@ -140,7 +153,23 @@
       </w:r>
       <w:proofErr w:type="spellEnd"/>
       <w:r>
-        <w:t xml:space="preserve"> (Berbagi Bites Jogja), telah </w:t>
+        <w:t xml:space="preserve"> (</w:t>
+      </w:r>
+      <w:proofErr w:type="spellStart"/>
+      <w:r>
+        <w:t>Berbagi</w:t>
+      </w:r>
+      <w:proofErr w:type="spellEnd"/>
+      <w:r>
+        <w:t xml:space="preserve"> Bites Jogja), </w:t>
+      </w:r>
+      <w:proofErr w:type="spellStart"/>
+      <w:r>
+        <w:t>telah</w:t>
+      </w:r>
+      <w:proofErr w:type="spellEnd"/>
+      <w:r>
+        <w:t xml:space="preserve"> </w:t>
       </w:r>
       <w:proofErr w:type="spellStart"/>
       <w:r>
@@ -156,8 +185,13 @@
       </w:r>
       <w:proofErr w:type="spellEnd"/>
       <w:r>
-        <w:t xml:space="preserve"> ke</w:t>
-      </w:r>
+        <w:t xml:space="preserve"> </w:t>
+      </w:r>
+      <w:proofErr w:type="spellStart"/>
+      <w:r>
+        <w:t>ke</w:t>
+      </w:r>
+      <w:proofErr w:type="spellEnd"/>
       <w:r>
         <w:t xml:space="preserve"> </w:t>
       </w:r>
@@ -208,7 +242,15 @@
       </w:r>
       <w:proofErr w:type="spellEnd"/>
       <w:r>
-        <w:t xml:space="preserve"> kembali </w:t>
+        <w:t xml:space="preserve"> </w:t>
+      </w:r>
+      <w:proofErr w:type="spellStart"/>
+      <w:r>
+        <w:t>kembali</w:t>
+      </w:r>
+      <w:proofErr w:type="spellEnd"/>
+      <w:r>
+        <w:t xml:space="preserve"> </w:t>
       </w:r>
       <w:proofErr w:type="spellStart"/>
       <w:r>
@@ -232,7 +274,23 @@
       </w:r>
       <w:proofErr w:type="spellEnd"/>
       <w:r>
-        <w:t xml:space="preserve"> tersebut dalam daftar </w:t>
+        <w:t xml:space="preserve"> </w:t>
+      </w:r>
+      <w:proofErr w:type="spellStart"/>
+      <w:r>
+        <w:t>tersebut</w:t>
+      </w:r>
+      <w:proofErr w:type="spellEnd"/>
+      <w:r>
+        <w:t xml:space="preserve"> </w:t>
+      </w:r>
+      <w:proofErr w:type="spellStart"/>
+      <w:r>
+        <w:t>dalam</w:t>
+      </w:r>
+      <w:proofErr w:type="spellEnd"/>
+      <w:r>
+        <w:t xml:space="preserve"> daftar </w:t>
       </w:r>
       <w:proofErr w:type="spellStart"/>
       <w:r>
@@ -249,8 +307,13 @@
         <w:ind w:firstLine="720"/>
         <w:jc w:val="both"/>
       </w:pPr>
-      <w:r>
-        <w:t xml:space="preserve">Berdasarkan </w:t>
+      <w:proofErr w:type="spellStart"/>
+      <w:r>
+        <w:t>Berdasarkan</w:t>
+      </w:r>
+      <w:proofErr w:type="spellEnd"/>
+      <w:r>
+        <w:t xml:space="preserve"> </w:t>
       </w:r>
       <w:proofErr w:type="spellStart"/>
       <w:r>
@@ -298,7 +361,15 @@
       </w:r>
       <w:proofErr w:type="spellEnd"/>
       <w:r>
-        <w:t xml:space="preserve"> yang telah </w:t>
+        <w:t xml:space="preserve"> yang </w:t>
+      </w:r>
+      <w:proofErr w:type="spellStart"/>
+      <w:r>
+        <w:t>telah</w:t>
+      </w:r>
+      <w:proofErr w:type="spellEnd"/>
+      <w:r>
+        <w:t xml:space="preserve"> </w:t>
       </w:r>
       <w:proofErr w:type="spellStart"/>
       <w:r>
@@ -306,7 +377,15 @@
       </w:r>
       <w:proofErr w:type="spellEnd"/>
       <w:r>
-        <w:t xml:space="preserve"> oleh Pihak </w:t>
+        <w:t xml:space="preserve"> oleh </w:t>
+      </w:r>
+      <w:proofErr w:type="spellStart"/>
+      <w:r>
+        <w:t>Pihak</w:t>
+      </w:r>
+      <w:proofErr w:type="spellEnd"/>
+      <w:r>
+        <w:t xml:space="preserve"> </w:t>
       </w:r>
       <w:proofErr w:type="spellStart"/>
       <w:r>
@@ -346,7 +425,15 @@
       </w:r>
       <w:proofErr w:type="spellEnd"/>
       <w:r>
-        <w:t xml:space="preserve"> dalam </w:t>
+        <w:t xml:space="preserve"> </w:t>
+      </w:r>
+      <w:proofErr w:type="spellStart"/>
+      <w:r>
+        <w:t>dalam</w:t>
+      </w:r>
+      <w:proofErr w:type="spellEnd"/>
+      <w:r>
+        <w:t xml:space="preserve"> </w:t>
       </w:r>
       <w:proofErr w:type="spellStart"/>
       <w:r>
@@ -362,7 +449,15 @@
       </w:r>
       <w:proofErr w:type="spellEnd"/>
       <w:r>
-        <w:t xml:space="preserve">, Pihak </w:t>
+        <w:t xml:space="preserve">, </w:t>
+      </w:r>
+      <w:proofErr w:type="spellStart"/>
+      <w:r>
+        <w:t>Pihak</w:t>
+      </w:r>
+      <w:proofErr w:type="spellEnd"/>
+      <w:r>
+        <w:t xml:space="preserve"> </w:t>
       </w:r>
       <w:proofErr w:type="spellStart"/>
       <w:r>
@@ -378,7 +473,15 @@
       </w:r>
       <w:proofErr w:type="spellEnd"/>
       <w:r>
-        <w:t xml:space="preserve"> distributor telah </w:t>
+        <w:t xml:space="preserve"> distributor </w:t>
+      </w:r>
+      <w:proofErr w:type="spellStart"/>
+      <w:r>
+        <w:t>telah</w:t>
+      </w:r>
+      <w:proofErr w:type="spellEnd"/>
+      <w:r>
+        <w:t xml:space="preserve"> </w:t>
       </w:r>
       <w:proofErr w:type="spellStart"/>
       <w:r>
@@ -394,7 +497,15 @@
       </w:r>
       <w:proofErr w:type="spellEnd"/>
       <w:r>
-        <w:t xml:space="preserve"> tersebut, yang </w:t>
+        <w:t xml:space="preserve"> </w:t>
+      </w:r>
+      <w:proofErr w:type="spellStart"/>
+      <w:r>
+        <w:t>tersebut</w:t>
+      </w:r>
+      <w:proofErr w:type="spellEnd"/>
+      <w:r>
+        <w:t xml:space="preserve">, yang </w:t>
       </w:r>
       <w:proofErr w:type="spellStart"/>
       <w:r>
@@ -402,7 +513,23 @@
       </w:r>
       <w:proofErr w:type="spellEnd"/>
       <w:r>
-        <w:t xml:space="preserve"> dengan dokumentasi </w:t>
+        <w:t xml:space="preserve"> </w:t>
+      </w:r>
+      <w:proofErr w:type="spellStart"/>
+      <w:r>
+        <w:t>dengan</w:t>
+      </w:r>
+      <w:proofErr w:type="spellEnd"/>
+      <w:r>
+        <w:t xml:space="preserve"> </w:t>
+      </w:r>
+      <w:proofErr w:type="spellStart"/>
+      <w:r>
+        <w:t>dokumentasi</w:t>
+      </w:r>
+      <w:proofErr w:type="spellEnd"/>
+      <w:r>
+        <w:t xml:space="preserve"> </w:t>
       </w:r>
       <w:proofErr w:type="spellStart"/>
       <w:r>
@@ -500,7 +627,39 @@
       </w:r>
       <w:proofErr w:type="spellEnd"/>
       <w:r>
-        <w:t xml:space="preserve"> ini dibuat untuk digunakan </w:t>
+        <w:t xml:space="preserve"> </w:t>
+      </w:r>
+      <w:proofErr w:type="spellStart"/>
+      <w:r>
+        <w:t>ini</w:t>
+      </w:r>
+      <w:proofErr w:type="spellEnd"/>
+      <w:r>
+        <w:t xml:space="preserve"> </w:t>
+      </w:r>
+      <w:proofErr w:type="spellStart"/>
+      <w:r>
+        <w:t>dibuat</w:t>
+      </w:r>
+      <w:proofErr w:type="spellEnd"/>
+      <w:r>
+        <w:t xml:space="preserve"> </w:t>
+      </w:r>
+      <w:proofErr w:type="spellStart"/>
+      <w:r>
+        <w:t>untuk</w:t>
+      </w:r>
+      <w:proofErr w:type="spellEnd"/>
+      <w:r>
+        <w:t xml:space="preserve"> </w:t>
+      </w:r>
+      <w:proofErr w:type="spellStart"/>
+      <w:r>
+        <w:t>digunakan</w:t>
+      </w:r>
+      <w:proofErr w:type="spellEnd"/>
+      <w:r>
+        <w:t xml:space="preserve"> </w:t>
       </w:r>
       <w:proofErr w:type="spellStart"/>
       <w:r>
@@ -1234,37 +1393,50 @@
 <w:ftr xmlns:wpc="http://schemas.microsoft.com/office/word/2010/wordprocessingCanvas" xmlns:cx="http://schemas.microsoft.com/office/drawing/2014/chartex" xmlns:cx1="http://schemas.microsoft.com/office/drawing/2015/9/8/chartex" xmlns:cx2="http://schemas.microsoft.com/office/drawing/2015/10/21/chartex" xmlns:cx3="http://schemas.microsoft.com/office/drawing/2016/5/9/chartex" xmlns:cx4="http://schemas.microsoft.com/office/drawing/2016/5/10/chartex" xmlns:cx5="http://schemas.microsoft.com/office/drawing/2016/5/11/chartex" xmlns:cx6="http://schemas.microsoft.com/office/drawing/2016/5/12/chartex" xmlns:cx7="http://schemas.microsoft.com/office/drawing/2016/5/13/chartex" xmlns:cx8="http://schemas.microsoft.com/office/drawing/2016/5/14/chartex" xmlns:mc="http://schemas.openxmlformats.org/markup-compatibility/2006" xmlns:aink="http://schemas.microsoft.com/office/drawing/2016/ink" xmlns:am3d="http://schemas.microsoft.com/office/drawing/2017/model3d" xmlns:o="urn:schemas-microsoft-com:office:office" xmlns:oel="http://schemas.microsoft.com/office/2019/extlst" xmlns:r="http://schemas.openxmlformats.org/officeDocument/2006/relationships" xmlns:m="http://schemas.openxmlformats.org/officeDocument/2006/math" xmlns:v="urn:schemas-microsoft-com:vml" xmlns:wp14="http://schemas.microsoft.com/office/word/2010/wordprocessingDrawing" xmlns:wp="http://schemas.openxmlformats.org/drawingml/2006/wordprocessingDrawing" xmlns:w10="urn:schemas-microsoft-com:office:word" xmlns:w="http://schemas.openxmlformats.org/wordprocessingml/2006/main" xmlns:w14="http://schemas.microsoft.com/office/word/2010/wordml" xmlns:w15="http://schemas.microsoft.com/office/word/2012/wordml" xmlns:w16cex="http://schemas.microsoft.com/office/word/2018/wordml/cex" xmlns:w16cid="http://schemas.microsoft.com/office/word/2016/wordml/cid" xmlns:w16="http://schemas.microsoft.com/office/word/2018/wordml" xmlns:w16du="http://schemas.microsoft.com/office/word/2023/wordml/word16du" xmlns:w16sdtdh="http://schemas.microsoft.com/office/word/2020/wordml/sdtdatahash" xmlns:w16sdtfl="http://schemas.microsoft.com/office/word/2024/wordml/sdtformatlock" xmlns:w16se="http://schemas.microsoft.com/office/word/2015/wordml/symex" xmlns:wpg="http://schemas.microsoft.com/office/word/2010/wordprocessingGroup" xmlns:wpi="http://schemas.microsoft.com/office/word/2010/wordprocessingInk" xmlns:wne="http://schemas.microsoft.com/office/word/2006/wordml" xmlns:wps="http://schemas.microsoft.com/office/word/2010/wordprocessingShape" mc:Ignorable="w14 w15 w16se w16cid w16 w16cex w16sdtdh w16sdtfl w16du wp14">
   <w:p>
     <w:pPr>
-      <w:pStyle w:val="Footer"/>
-      <w:rPr>
-        <w:b/>
-        <w:bCs/>
-        <w:i/>
-        <w:iCs/>
+      <w:spacing w:after="0" w:line="276" w:lineRule="auto"/>
+      <w:rPr>
+        <w:rFonts w:ascii="Times New Roman" w:eastAsia="Times New Roman" w:hAnsi="Times New Roman" w:cs="Times New Roman"/>
+        <w:kern w:val="0"/>
         <w:sz w:val="18"/>
         <w:szCs w:val="18"/>
+        <w:lang w:val="en" w:eastAsia="ja-JP"/>
+        <w14:ligatures w14:val="none"/>
       </w:rPr>
     </w:pPr>
     <w:r>
       <w:rPr>
-        <w:b/>
-        <w:bCs/>
-        <w:i/>
-        <w:iCs/>
+        <w:rFonts w:ascii="Times New Roman" w:eastAsia="Times New Roman" w:hAnsi="Times New Roman" w:cs="Times New Roman"/>
+        <w:kern w:val="0"/>
         <w:sz w:val="18"/>
         <w:szCs w:val="18"/>
-      </w:rPr>
-      <w:t>Berbagi Bites Jogja (BBJ) | Reducing Food Waste © ${year}</w:t>
+        <w:lang w:val="en" w:eastAsia="ja-JP"/>
+        <w14:ligatures w14:val="none"/>
+      </w:rPr>
+      <w:t xml:space="preserve">| </w:t>
     </w:r>
+    <w:proofErr w:type="spellStart"/>
     <w:r>
       <w:rPr>
-        <w:b/>
-        <w:bCs/>
-        <w:i/>
-        <w:iCs/>
+        <w:rFonts w:ascii="Times New Roman" w:eastAsia="Times New Roman" w:hAnsi="Times New Roman" w:cs="Times New Roman"/>
+        <w:kern w:val="0"/>
         <w:sz w:val="18"/>
         <w:szCs w:val="18"/>
-      </w:rPr>
-      <w:t xml:space="preserve"> </w:t>
+        <w:lang w:val="en" w:eastAsia="ja-JP"/>
+        <w14:ligatures w14:val="none"/>
+      </w:rPr>
+      <w:t>Berbagi</w:t>
+    </w:r>
+    <w:proofErr w:type="spellEnd"/>
+    <w:r>
+      <w:rPr>
+        <w:rFonts w:ascii="Times New Roman" w:eastAsia="Times New Roman" w:hAnsi="Times New Roman" w:cs="Times New Roman"/>
+        <w:kern w:val="0"/>
+        <w:sz w:val="18"/>
+        <w:szCs w:val="18"/>
+        <w:lang w:val="en" w:eastAsia="ja-JP"/>
+        <w14:ligatures w14:val="none"/>
+      </w:rPr>
+      <w:t xml:space="preserve"> Bites Jogja (BBJ) </w:t>
     </w:r>
   </w:p>
   <w:p>
@@ -1287,7 +1459,7 @@
         <w:sz w:val="10"/>
         <w:szCs w:val="10"/>
       </w:rPr>
-      <w:t>created at ${</w:t>
+      <w:t>created at ${cr</w:t>
     </w:r>
     <w:proofErr w:type="spellStart"/>
     <w:r>
@@ -1298,7 +1470,7 @@
         <w:sz w:val="10"/>
         <w:szCs w:val="10"/>
       </w:rPr>
-      <w:t>createdDate</w:t>
+      <w:t>eatedDate</w:t>
     </w:r>
     <w:proofErr w:type="spellEnd"/>
     <w:r>
@@ -1344,49 +1516,69 @@
 <w:hdr xmlns:wpc="http://schemas.microsoft.com/office/word/2010/wordprocessingCanvas" xmlns:cx="http://schemas.microsoft.com/office/drawing/2014/chartex" xmlns:cx1="http://schemas.microsoft.com/office/drawing/2015/9/8/chartex" xmlns:cx2="http://schemas.microsoft.com/office/drawing/2015/10/21/chartex" xmlns:cx3="http://schemas.microsoft.com/office/drawing/2016/5/9/chartex" xmlns:cx4="http://schemas.microsoft.com/office/drawing/2016/5/10/chartex" xmlns:cx5="http://schemas.microsoft.com/office/drawing/2016/5/11/chartex" xmlns:cx6="http://schemas.microsoft.com/office/drawing/2016/5/12/chartex" xmlns:cx7="http://schemas.microsoft.com/office/drawing/2016/5/13/chartex" xmlns:cx8="http://schemas.microsoft.com/office/drawing/2016/5/14/chartex" xmlns:mc="http://schemas.openxmlformats.org/markup-compatibility/2006" xmlns:aink="http://schemas.microsoft.com/office/drawing/2016/ink" xmlns:am3d="http://schemas.microsoft.com/office/drawing/2017/model3d" xmlns:o="urn:schemas-microsoft-com:office:office" xmlns:oel="http://schemas.microsoft.com/office/2019/extlst" xmlns:r="http://schemas.openxmlformats.org/officeDocument/2006/relationships" xmlns:m="http://schemas.openxmlformats.org/officeDocument/2006/math" xmlns:v="urn:schemas-microsoft-com:vml" xmlns:wp14="http://schemas.microsoft.com/office/word/2010/wordprocessingDrawing" xmlns:wp="http://schemas.openxmlformats.org/drawingml/2006/wordprocessingDrawing" xmlns:w10="urn:schemas-microsoft-com:office:word" xmlns:w="http://schemas.openxmlformats.org/wordprocessingml/2006/main" xmlns:w14="http://schemas.microsoft.com/office/word/2010/wordml" xmlns:w15="http://schemas.microsoft.com/office/word/2012/wordml" xmlns:w16cex="http://schemas.microsoft.com/office/word/2018/wordml/cex" xmlns:w16cid="http://schemas.microsoft.com/office/word/2016/wordml/cid" xmlns:w16="http://schemas.microsoft.com/office/word/2018/wordml" xmlns:w16du="http://schemas.microsoft.com/office/word/2023/wordml/word16du" xmlns:w16sdtdh="http://schemas.microsoft.com/office/word/2020/wordml/sdtdatahash" xmlns:w16sdtfl="http://schemas.microsoft.com/office/word/2024/wordml/sdtformatlock" xmlns:w16se="http://schemas.microsoft.com/office/word/2015/wordml/symex" xmlns:wpg="http://schemas.microsoft.com/office/word/2010/wordprocessingGroup" xmlns:wpi="http://schemas.microsoft.com/office/word/2010/wordprocessingInk" xmlns:wne="http://schemas.microsoft.com/office/word/2006/wordml" xmlns:wps="http://schemas.microsoft.com/office/word/2010/wordprocessingShape" mc:Ignorable="w14 w15 w16se w16cid w16 w16cex w16sdtdh w16sdtfl w16du wp14">
   <w:p>
     <w:pPr>
-      <w:spacing w:after="0"/>
-      <w:rPr>
+      <w:spacing w:after="0" w:line="240" w:lineRule="auto"/>
+      <w:ind w:left="1418"/>
+      <w:jc w:val="center"/>
+      <w:rPr>
+        <w:rFonts w:ascii="Times New Roman" w:eastAsia="Times New Roman" w:hAnsi="Times New Roman" w:cs="Times New Roman"/>
         <w:b/>
         <w:bCs/>
+        <w:kern w:val="0"/>
+        <w:sz w:val="36"/>
+        <w:szCs w:val="36"/>
+        <w:lang w:val="en" w:eastAsia="ja-JP"/>
+        <w14:ligatures w14:val="none"/>
       </w:rPr>
     </w:pPr>
+    <w:bookmarkStart w:id="0" w:name="_heading=h.m62bmqnepxou" w:colFirst="0" w:colLast="0"/>
+    <w:bookmarkEnd w:id="0"/>
     <w:r>
       <w:rPr>
+        <w:rFonts w:ascii="Times New Roman" w:eastAsia="Times New Roman" w:hAnsi="Times New Roman" w:cs="Times New Roman"/>
+        <w:b/>
+        <w:bCs/>
+        <w:kern w:val="0"/>
+        <w:sz w:val="36"/>
+        <w:szCs w:val="36"/>
+        <w:lang w:val="en" w:eastAsia="ja-JP"/>
+        <w14:ligatures w14:val="none"/>
+      </w:rPr>
+      <w:t>BERBAGI BITES JOGJA</w:t>
+    </w:r>
+    <w:r>
+      <w:rPr>
+        <w:rFonts w:ascii="Arial" w:eastAsia="Arial" w:hAnsi="Arial" w:cs="Arial"/>
         <w:noProof/>
-        <w:sz w:val="20"/>
-        <w:szCs w:val="20"/>
+        <w:kern w:val="0"/>
+        <w:sz w:val="22"/>
+        <w:szCs w:val="22"/>
+        <w:lang w:val="en" w:eastAsia="ja-JP"/>
+        <w14:ligatures w14:val="none"/>
       </w:rPr>
       <w:drawing>
-        <wp:anchor distT="0" distB="0" distL="114300" distR="114300" simplePos="0" relativeHeight="251658240" behindDoc="0" locked="0" layoutInCell="1" allowOverlap="1" wp14:anchorId="4E7CFD74" wp14:editId="5D0570FA">
+        <wp:anchor distT="0" distB="0" distL="0" distR="0" simplePos="0" relativeHeight="251661312" behindDoc="0" locked="0" layoutInCell="1" hidden="0" allowOverlap="1" wp14:anchorId="4BA6F211" wp14:editId="5EA15555">
           <wp:simplePos x="0" y="0"/>
           <wp:positionH relativeFrom="column">
-            <wp:posOffset>7620</wp:posOffset>
+            <wp:posOffset>-28574</wp:posOffset>
           </wp:positionH>
           <wp:positionV relativeFrom="paragraph">
-            <wp:posOffset>7620</wp:posOffset>
+            <wp:posOffset>-66674</wp:posOffset>
           </wp:positionV>
-          <wp:extent cx="815340" cy="815340"/>
-          <wp:effectExtent l="0" t="0" r="0" b="3810"/>
+          <wp:extent cx="933450" cy="933450"/>
+          <wp:effectExtent l="0" t="0" r="0" b="0"/>
           <wp:wrapNone/>
-          <wp:docPr id="1527320270" name="Picture 2" descr="A blue and black logo&#10;&#10;Description automatically generated"/>
-          <wp:cNvGraphicFramePr>
-            <a:graphicFrameLocks xmlns:a="http://schemas.openxmlformats.org/drawingml/2006/main" noChangeAspect="1"/>
-          </wp:cNvGraphicFramePr>
+          <wp:docPr id="1036957696" name="image1.png"/>
+          <wp:cNvGraphicFramePr/>
           <a:graphic xmlns:a="http://schemas.openxmlformats.org/drawingml/2006/main">
             <a:graphicData uri="http://schemas.openxmlformats.org/drawingml/2006/picture">
               <pic:pic xmlns:pic="http://schemas.openxmlformats.org/drawingml/2006/picture">
                 <pic:nvPicPr>
-                  <pic:cNvPr id="1527320270" name="Picture 2" descr="A blue and black logo&#10;&#10;Description automatically generated"/>
-                  <pic:cNvPicPr/>
+                  <pic:cNvPr id="0" name="image1.png"/>
+                  <pic:cNvPicPr preferRelativeResize="0"/>
                 </pic:nvPicPr>
                 <pic:blipFill>
-                  <a:blip r:embed="rId1">
-                    <a:extLst>
-                      <a:ext uri="{28A0092B-C50C-407E-A947-70E740481C1C}">
-                        <a14:useLocalDpi xmlns:a14="http://schemas.microsoft.com/office/drawing/2010/main" val="0"/>
-                      </a:ext>
-                    </a:extLst>
-                  </a:blip>
+                  <a:blip r:embed="rId1"/>
+                  <a:srcRect l="21484" r="21034" b="43989"/>
                   <a:stretch>
                     <a:fillRect/>
                   </a:stretch>
@@ -1394,149 +1586,304 @@
                 <pic:spPr>
                   <a:xfrm>
                     <a:off x="0" y="0"/>
-                    <a:ext cx="815340" cy="815340"/>
+                    <a:ext cx="933450" cy="933450"/>
                   </a:xfrm>
                   <a:prstGeom prst="rect">
                     <a:avLst/>
                   </a:prstGeom>
+                  <a:ln/>
                 </pic:spPr>
               </pic:pic>
             </a:graphicData>
           </a:graphic>
-          <wp14:sizeRelH relativeFrom="page">
-            <wp14:pctWidth>0</wp14:pctWidth>
-          </wp14:sizeRelH>
-          <wp14:sizeRelV relativeFrom="page">
-            <wp14:pctHeight>0</wp14:pctHeight>
-          </wp14:sizeRelV>
         </wp:anchor>
       </w:drawing>
-    </w:r>
-    <w:r>
-      <w:tab/>
-    </w:r>
-    <w:r>
-      <w:tab/>
-    </w:r>
-    <w:r>
-      <w:rPr>
-        <w:b/>
-        <w:bCs/>
-        <w:sz w:val="32"/>
-        <w:szCs w:val="32"/>
-      </w:rPr>
-      <w:t>Berbagi Bites Jogja</w:t>
     </w:r>
   </w:p>
   <w:p>
     <w:pPr>
-      <w:spacing w:after="0"/>
-      <w:ind w:left="720" w:firstLine="720"/>
-      <w:rPr>
-        <w:sz w:val="20"/>
-        <w:szCs w:val="20"/>
+      <w:spacing w:after="0" w:line="240" w:lineRule="auto"/>
+      <w:ind w:left="1418"/>
+      <w:jc w:val="center"/>
+      <w:rPr>
+        <w:rFonts w:ascii="Times New Roman" w:eastAsia="Times New Roman" w:hAnsi="Times New Roman" w:cs="Times New Roman"/>
+        <w:b/>
+        <w:bCs/>
+        <w:kern w:val="0"/>
+        <w:sz w:val="16"/>
+        <w:szCs w:val="16"/>
+        <w:lang w:val="en" w:eastAsia="ja-JP"/>
+        <w14:ligatures w14:val="none"/>
+      </w:rPr>
+    </w:pPr>
+  </w:p>
+  <w:p>
+    <w:pPr>
+      <w:tabs>
+        <w:tab w:val="center" w:pos="2410"/>
+        <w:tab w:val="right" w:pos="8647"/>
+      </w:tabs>
+      <w:spacing w:after="0" w:line="240" w:lineRule="auto"/>
+      <w:ind w:left="1418"/>
+      <w:jc w:val="center"/>
+      <w:rPr>
+        <w:rFonts w:ascii="Times New Roman" w:eastAsia="Times New Roman" w:hAnsi="Times New Roman" w:cs="Times New Roman"/>
+        <w:kern w:val="0"/>
+        <w:sz w:val="22"/>
+        <w:szCs w:val="22"/>
+        <w:lang w:val="en" w:eastAsia="ja-JP"/>
+        <w14:ligatures w14:val="none"/>
       </w:rPr>
     </w:pPr>
     <w:r>
       <w:rPr>
-        <w:sz w:val="20"/>
-        <w:szCs w:val="20"/>
-      </w:rPr>
-      <w:t xml:space="preserve">Jalan Podocarpus II Nomor 22D </w:t>
+        <w:rFonts w:ascii="Times New Roman" w:eastAsia="Times New Roman" w:hAnsi="Times New Roman" w:cs="Times New Roman"/>
+        <w:kern w:val="0"/>
+        <w:sz w:val="22"/>
+        <w:szCs w:val="22"/>
+        <w:lang w:val="en" w:eastAsia="ja-JP"/>
+        <w14:ligatures w14:val="none"/>
+      </w:rPr>
+      <w:t xml:space="preserve">Jl. Podocarpus II D-22, </w:t>
     </w:r>
     <w:proofErr w:type="spellStart"/>
     <w:r>
       <w:rPr>
-        <w:sz w:val="20"/>
-        <w:szCs w:val="20"/>
+        <w:rFonts w:ascii="Times New Roman" w:eastAsia="Times New Roman" w:hAnsi="Times New Roman" w:cs="Times New Roman"/>
+        <w:kern w:val="0"/>
+        <w:sz w:val="22"/>
+        <w:szCs w:val="22"/>
+        <w:lang w:val="en" w:eastAsia="ja-JP"/>
+        <w14:ligatures w14:val="none"/>
       </w:rPr>
       <w:t>Bulaksumur</w:t>
     </w:r>
     <w:proofErr w:type="spellEnd"/>
     <w:r>
       <w:rPr>
-        <w:sz w:val="20"/>
-        <w:szCs w:val="20"/>
+        <w:rFonts w:ascii="Times New Roman" w:eastAsia="Times New Roman" w:hAnsi="Times New Roman" w:cs="Times New Roman"/>
+        <w:kern w:val="0"/>
+        <w:sz w:val="22"/>
+        <w:szCs w:val="22"/>
+        <w:lang w:val="en" w:eastAsia="ja-JP"/>
+        <w14:ligatures w14:val="none"/>
       </w:rPr>
       <w:t xml:space="preserve">, Sagan, </w:t>
     </w:r>
     <w:proofErr w:type="spellStart"/>
     <w:r>
       <w:rPr>
-        <w:sz w:val="20"/>
-        <w:szCs w:val="20"/>
+        <w:rFonts w:ascii="Times New Roman" w:eastAsia="Times New Roman" w:hAnsi="Times New Roman" w:cs="Times New Roman"/>
+        <w:kern w:val="0"/>
+        <w:sz w:val="22"/>
+        <w:szCs w:val="22"/>
+        <w:lang w:val="en" w:eastAsia="ja-JP"/>
+        <w14:ligatures w14:val="none"/>
       </w:rPr>
       <w:t>Caturtunggal</w:t>
     </w:r>
     <w:proofErr w:type="spellEnd"/>
     <w:r>
       <w:rPr>
-        <w:sz w:val="20"/>
-        <w:szCs w:val="20"/>
-      </w:rPr>
-      <w:t>,</w:t>
+        <w:rFonts w:ascii="Times New Roman" w:eastAsia="Times New Roman" w:hAnsi="Times New Roman" w:cs="Times New Roman"/>
+        <w:kern w:val="0"/>
+        <w:sz w:val="22"/>
+        <w:szCs w:val="22"/>
+        <w:lang w:val="en" w:eastAsia="ja-JP"/>
+        <w14:ligatures w14:val="none"/>
+      </w:rPr>
+      <w:t xml:space="preserve">, </w:t>
+    </w:r>
+    <w:proofErr w:type="spellStart"/>
+    <w:r>
+      <w:rPr>
+        <w:rFonts w:ascii="Times New Roman" w:eastAsia="Times New Roman" w:hAnsi="Times New Roman" w:cs="Times New Roman"/>
+        <w:kern w:val="0"/>
+        <w:sz w:val="22"/>
+        <w:szCs w:val="22"/>
+        <w:lang w:val="en" w:eastAsia="ja-JP"/>
+        <w14:ligatures w14:val="none"/>
+      </w:rPr>
+      <w:t>Kecamatan</w:t>
+    </w:r>
+    <w:proofErr w:type="spellEnd"/>
+    <w:r>
+      <w:rPr>
+        <w:rFonts w:ascii="Times New Roman" w:eastAsia="Times New Roman" w:hAnsi="Times New Roman" w:cs="Times New Roman"/>
+        <w:kern w:val="0"/>
+        <w:sz w:val="22"/>
+        <w:szCs w:val="22"/>
+        <w:lang w:val="en" w:eastAsia="ja-JP"/>
+        <w14:ligatures w14:val="none"/>
+      </w:rPr>
+      <w:t xml:space="preserve"> Depok, </w:t>
+    </w:r>
+    <w:proofErr w:type="spellStart"/>
+    <w:r>
+      <w:rPr>
+        <w:rFonts w:ascii="Times New Roman" w:eastAsia="Times New Roman" w:hAnsi="Times New Roman" w:cs="Times New Roman"/>
+        <w:kern w:val="0"/>
+        <w:sz w:val="22"/>
+        <w:szCs w:val="22"/>
+        <w:lang w:val="en" w:eastAsia="ja-JP"/>
+        <w14:ligatures w14:val="none"/>
+      </w:rPr>
+      <w:t>Kabupaten</w:t>
+    </w:r>
+    <w:proofErr w:type="spellEnd"/>
+    <w:r>
+      <w:rPr>
+        <w:rFonts w:ascii="Times New Roman" w:eastAsia="Times New Roman" w:hAnsi="Times New Roman" w:cs="Times New Roman"/>
+        <w:kern w:val="0"/>
+        <w:sz w:val="22"/>
+        <w:szCs w:val="22"/>
+        <w:lang w:val="en" w:eastAsia="ja-JP"/>
+        <w14:ligatures w14:val="none"/>
+      </w:rPr>
+      <w:t xml:space="preserve"> Sleman, Daerah Istimewa Yogyakarta 55281</w:t>
     </w:r>
   </w:p>
   <w:p>
     <w:pPr>
-      <w:spacing w:after="0"/>
-      <w:ind w:left="720" w:firstLine="720"/>
-      <w:rPr>
+      <w:tabs>
+        <w:tab w:val="center" w:pos="4513"/>
+        <w:tab w:val="right" w:pos="9026"/>
+        <w:tab w:val="center" w:pos="2410"/>
+        <w:tab w:val="right" w:pos="8647"/>
+      </w:tabs>
+      <w:spacing w:after="0" w:line="240" w:lineRule="auto"/>
+      <w:ind w:left="1418"/>
+      <w:jc w:val="center"/>
+      <w:rPr>
+        <w:rFonts w:ascii="Times New Roman" w:eastAsia="Times New Roman" w:hAnsi="Times New Roman" w:cs="Times New Roman"/>
+        <w:kern w:val="0"/>
         <w:sz w:val="20"/>
         <w:szCs w:val="20"/>
+        <w:lang w:val="en" w:eastAsia="ja-JP"/>
+        <w14:ligatures w14:val="none"/>
       </w:rPr>
     </w:pPr>
     <w:proofErr w:type="spellStart"/>
     <w:r>
       <w:rPr>
+        <w:rFonts w:ascii="Times New Roman" w:eastAsia="Times New Roman" w:hAnsi="Times New Roman" w:cs="Times New Roman"/>
+        <w:kern w:val="0"/>
         <w:sz w:val="20"/>
         <w:szCs w:val="20"/>
-      </w:rPr>
-      <w:t>Kecamatan</w:t>
+        <w:lang w:val="en" w:eastAsia="ja-JP"/>
+        <w14:ligatures w14:val="none"/>
+      </w:rPr>
+      <w:t>Telepon</w:t>
     </w:r>
     <w:proofErr w:type="spellEnd"/>
     <w:r>
       <w:rPr>
+        <w:rFonts w:ascii="Times New Roman" w:eastAsia="Times New Roman" w:hAnsi="Times New Roman" w:cs="Times New Roman"/>
+        <w:kern w:val="0"/>
         <w:sz w:val="20"/>
         <w:szCs w:val="20"/>
-      </w:rPr>
-      <w:t xml:space="preserve"> Depok, </w:t>
+        <w:lang w:val="en" w:eastAsia="ja-JP"/>
+        <w14:ligatures w14:val="none"/>
+      </w:rPr>
+      <w:t xml:space="preserve"> +</w:t>
     </w:r>
-    <w:proofErr w:type="spellStart"/>
+    <w:proofErr w:type="gramStart"/>
     <w:r>
       <w:rPr>
+        <w:rFonts w:ascii="Times New Roman" w:eastAsia="Times New Roman" w:hAnsi="Times New Roman" w:cs="Times New Roman"/>
+        <w:kern w:val="0"/>
         <w:sz w:val="20"/>
         <w:szCs w:val="20"/>
-      </w:rPr>
-      <w:t>Kabupaten</w:t>
+        <w:lang w:val="en" w:eastAsia="ja-JP"/>
+        <w14:ligatures w14:val="none"/>
+      </w:rPr>
+      <w:t>628986950700  |</w:t>
     </w:r>
-    <w:proofErr w:type="spellEnd"/>
+    <w:proofErr w:type="gramEnd"/>
     <w:r>
       <w:rPr>
+        <w:rFonts w:ascii="Times New Roman" w:eastAsia="Times New Roman" w:hAnsi="Times New Roman" w:cs="Times New Roman"/>
+        <w:kern w:val="0"/>
         <w:sz w:val="20"/>
         <w:szCs w:val="20"/>
-      </w:rPr>
-      <w:t xml:space="preserve"> Sleman,</w:t>
+        <w:lang w:val="en" w:eastAsia="ja-JP"/>
+        <w14:ligatures w14:val="none"/>
+      </w:rPr>
+      <w:t xml:space="preserve">  Surel </w:t>
     </w:r>
+    <w:hyperlink r:id="rId2">
+      <w:r>
+        <w:rPr>
+          <w:rFonts w:ascii="Times New Roman" w:eastAsia="Times New Roman" w:hAnsi="Times New Roman" w:cs="Times New Roman"/>
+          <w:color w:val="0563C1"/>
+          <w:kern w:val="0"/>
+          <w:sz w:val="20"/>
+          <w:szCs w:val="20"/>
+          <w:u w:val="single"/>
+          <w:lang w:val="en" w:eastAsia="ja-JP"/>
+          <w14:ligatures w14:val="none"/>
+        </w:rPr>
+        <w:t>berbagibitesjogja@gmail.com</w:t>
+      </w:r>
+    </w:hyperlink>
     <w:r>
       <w:rPr>
+        <w:rFonts w:ascii="Times New Roman" w:eastAsia="Times New Roman" w:hAnsi="Times New Roman" w:cs="Times New Roman"/>
+        <w:kern w:val="0"/>
         <w:sz w:val="20"/>
         <w:szCs w:val="20"/>
-      </w:rPr>
-      <w:t xml:space="preserve"> </w:t>
+        <w:lang w:val="en" w:eastAsia="ja-JP"/>
+        <w14:ligatures w14:val="none"/>
+      </w:rPr>
+      <w:t xml:space="preserve">  |  Situs </w:t>
     </w:r>
+    <w:hyperlink r:id="rId3">
+      <w:r>
+        <w:rPr>
+          <w:rFonts w:ascii="Times New Roman" w:eastAsia="Times New Roman" w:hAnsi="Times New Roman" w:cs="Times New Roman"/>
+          <w:color w:val="1155CC"/>
+          <w:kern w:val="0"/>
+          <w:sz w:val="20"/>
+          <w:szCs w:val="20"/>
+          <w:u w:val="single"/>
+          <w:lang w:val="en" w:eastAsia="ja-JP"/>
+          <w14:ligatures w14:val="none"/>
+        </w:rPr>
+        <w:t>berbagibitesjogja.com</w:t>
+      </w:r>
+    </w:hyperlink>
     <w:r>
       <w:rPr>
+        <w:rFonts w:ascii="Times New Roman" w:eastAsia="Times New Roman" w:hAnsi="Times New Roman" w:cs="Times New Roman"/>
+        <w:kern w:val="0"/>
         <w:sz w:val="20"/>
         <w:szCs w:val="20"/>
-      </w:rPr>
-      <w:t>Daerah Istimewa Yogyakarta 55281</w:t>
+        <w:lang w:val="en" w:eastAsia="ja-JP"/>
+        <w14:ligatures w14:val="none"/>
+      </w:rPr>
+      <w:t xml:space="preserve"> </w:t>
     </w:r>
   </w:p>
   <w:p>
     <w:pPr>
+      <w:pBdr>
+        <w:bottom w:val="single" w:sz="6" w:space="1" w:color="000000"/>
+      </w:pBdr>
       <w:spacing w:after="0"/>
-      <w:ind w:left="720" w:firstLine="720"/>
+      <w:rPr>
+        <w:rFonts w:ascii="Times New Roman" w:eastAsia="Times New Roman" w:hAnsi="Times New Roman" w:cs="Times New Roman"/>
+        <w:kern w:val="0"/>
+        <w:lang w:val="en" w:eastAsia="ja-JP"/>
+        <w14:ligatures w14:val="none"/>
+      </w:rPr>
+    </w:pPr>
+  </w:p>
+  <w:p>
+    <w:pPr>
+      <w:tabs>
+        <w:tab w:val="right" w:pos="9026"/>
+      </w:tabs>
+      <w:spacing w:after="0"/>
       <w:rPr>
         <w:i/>
         <w:iCs/>
@@ -1544,242 +1891,6 @@
         <w:szCs w:val="18"/>
       </w:rPr>
     </w:pPr>
-    <w:r>
-      <w:rPr>
-        <w:i/>
-        <w:iCs/>
-        <w:sz w:val="18"/>
-        <w:szCs w:val="18"/>
-      </w:rPr>
-      <w:t>email :</w:t>
-    </w:r>
-    <w:r>
-      <w:rPr>
-        <w:i/>
-        <w:iCs/>
-        <w:sz w:val="18"/>
-        <w:szCs w:val="18"/>
-      </w:rPr>
-      <w:t xml:space="preserve"> </w:t>
-    </w:r>
-    <w:hyperlink r:id="rId2" w:history="1">
-      <w:r>
-        <w:rPr>
-          <w:rStyle w:val="Hyperlink"/>
-          <w:i/>
-          <w:iCs/>
-          <w:sz w:val="18"/>
-          <w:szCs w:val="18"/>
-        </w:rPr>
-        <w:t>berbagibitesjogja@gmail.com</w:t>
-      </w:r>
-    </w:hyperlink>
-    <w:r>
-      <w:rPr>
-        <w:i/>
-        <w:iCs/>
-        <w:sz w:val="18"/>
-        <w:szCs w:val="18"/>
-      </w:rPr>
-      <w:t xml:space="preserve"> </w:t>
-    </w:r>
-    <w:r>
-      <w:rPr>
-        <w:sz w:val="18"/>
-        <w:szCs w:val="18"/>
-      </w:rPr>
-      <w:t>|</w:t>
-    </w:r>
-    <w:r>
-      <w:rPr>
-        <w:i/>
-        <w:iCs/>
-        <w:sz w:val="18"/>
-        <w:szCs w:val="18"/>
-      </w:rPr>
-      <w:t xml:space="preserve"> </w:t>
-    </w:r>
-    <w:r>
-      <w:rPr>
-        <w:i/>
-        <w:iCs/>
-        <w:sz w:val="18"/>
-        <w:szCs w:val="18"/>
-      </w:rPr>
-      <w:t>phone</w:t>
-    </w:r>
-    <w:r>
-      <w:rPr>
-        <w:i/>
-        <w:iCs/>
-        <w:sz w:val="18"/>
-        <w:szCs w:val="18"/>
-      </w:rPr>
-      <w:t xml:space="preserve"> :</w:t>
-    </w:r>
-    <w:r>
-      <w:rPr>
-        <w:i/>
-        <w:iCs/>
-        <w:sz w:val="18"/>
-        <w:szCs w:val="18"/>
-      </w:rPr>
-      <w:t xml:space="preserve"> +</w:t>
-    </w:r>
-    <w:hyperlink r:id="rId3" w:history="1">
-      <w:r>
-        <w:rPr>
-          <w:rStyle w:val="Hyperlink"/>
-          <w:i/>
-          <w:iCs/>
-          <w:sz w:val="18"/>
-          <w:szCs w:val="18"/>
-        </w:rPr>
-        <w:t>628986950700</w:t>
-      </w:r>
-    </w:hyperlink>
-    <w:r>
-      <w:rPr>
-        <w:i/>
-        <w:iCs/>
-        <w:sz w:val="18"/>
-        <w:szCs w:val="18"/>
-      </w:rPr>
-      <w:t xml:space="preserve"> </w:t>
-    </w:r>
-    <w:r>
-      <w:rPr>
-        <w:sz w:val="18"/>
-        <w:szCs w:val="18"/>
-      </w:rPr>
-      <w:t xml:space="preserve">| </w:t>
-    </w:r>
-    <w:r>
-      <w:rPr>
-        <w:i/>
-        <w:iCs/>
-        <w:sz w:val="18"/>
-        <w:szCs w:val="18"/>
-      </w:rPr>
-      <w:t>site</w:t>
-    </w:r>
-    <w:r>
-      <w:rPr>
-        <w:i/>
-        <w:iCs/>
-        <w:sz w:val="18"/>
-        <w:szCs w:val="18"/>
-      </w:rPr>
-      <w:t xml:space="preserve"> : </w:t>
-    </w:r>
-    <w:hyperlink r:id="rId4" w:history="1">
-      <w:r>
-        <w:rPr>
-          <w:rStyle w:val="Hyperlink"/>
-          <w:i/>
-          <w:iCs/>
-          <w:sz w:val="18"/>
-          <w:szCs w:val="18"/>
-        </w:rPr>
-        <w:t>berbagibitesjogja.com</w:t>
-      </w:r>
-    </w:hyperlink>
-  </w:p>
-  <w:p>
-    <w:pPr>
-      <w:spacing w:after="0"/>
-      <w:ind w:left="1440" w:firstLine="720"/>
-      <w:rPr>
-        <w:i/>
-        <w:iCs/>
-        <w:sz w:val="18"/>
-        <w:szCs w:val="18"/>
-      </w:rPr>
-    </w:pPr>
-  </w:p>
-  <w:p>
-    <w:pPr>
-      <w:spacing w:after="0"/>
-      <w:ind w:left="1440" w:firstLine="720"/>
-      <w:rPr>
-        <w:i/>
-        <w:iCs/>
-        <w:sz w:val="18"/>
-        <w:szCs w:val="18"/>
-      </w:rPr>
-    </w:pPr>
-    <w:r>
-      <w:rPr>
-        <w:i/>
-        <w:iCs/>
-        <w:noProof/>
-        <w:sz w:val="18"/>
-        <w:szCs w:val="18"/>
-      </w:rPr>
-      <mc:AlternateContent>
-        <mc:Choice Requires="wps">
-          <w:drawing>
-            <wp:anchor distT="0" distB="0" distL="114300" distR="114300" simplePos="0" relativeHeight="251659264" behindDoc="0" locked="0" layoutInCell="1" allowOverlap="1" wp14:anchorId="581C5BEC" wp14:editId="5B6B3036">
-              <wp:simplePos x="0" y="0"/>
-              <wp:positionH relativeFrom="margin">
-                <wp:align>left</wp:align>
-              </wp:positionH>
-              <wp:positionV relativeFrom="paragraph">
-                <wp:posOffset>36195</wp:posOffset>
-              </wp:positionV>
-              <wp:extent cx="5707380" cy="0"/>
-              <wp:effectExtent l="0" t="0" r="0" b="0"/>
-              <wp:wrapNone/>
-              <wp:docPr id="709844669" name="Straight Connector 4"/>
-              <wp:cNvGraphicFramePr/>
-              <a:graphic xmlns:a="http://schemas.openxmlformats.org/drawingml/2006/main">
-                <a:graphicData uri="http://schemas.microsoft.com/office/word/2010/wordprocessingShape">
-                  <wps:wsp>
-                    <wps:cNvCnPr/>
-                    <wps:spPr>
-                      <a:xfrm>
-                        <a:off x="0" y="0"/>
-                        <a:ext cx="5707380" cy="0"/>
-                      </a:xfrm>
-                      <a:prstGeom prst="line">
-                        <a:avLst/>
-                      </a:prstGeom>
-                      <a:ln w="12700"/>
-                    </wps:spPr>
-                    <wps:style>
-                      <a:lnRef idx="1">
-                        <a:schemeClr val="accent1"/>
-                      </a:lnRef>
-                      <a:fillRef idx="0">
-                        <a:schemeClr val="accent1"/>
-                      </a:fillRef>
-                      <a:effectRef idx="0">
-                        <a:schemeClr val="accent1"/>
-                      </a:effectRef>
-                      <a:fontRef idx="minor">
-                        <a:schemeClr val="tx1"/>
-                      </a:fontRef>
-                    </wps:style>
-                    <wps:bodyPr/>
-                  </wps:wsp>
-                </a:graphicData>
-              </a:graphic>
-              <wp14:sizeRelH relativeFrom="margin">
-                <wp14:pctWidth>0</wp14:pctWidth>
-              </wp14:sizeRelH>
-            </wp:anchor>
-          </w:drawing>
-        </mc:Choice>
-        <mc:Fallback>
-          <w:pict>
-            <v:line w14:anchorId="6341D582" id="Straight Connector 4" o:spid="_x0000_s1026" style="position:absolute;z-index:251659264;visibility:visible;mso-wrap-style:square;mso-width-percent:0;mso-wrap-distance-left:9pt;mso-wrap-distance-top:0;mso-wrap-distance-right:9pt;mso-wrap-distance-bottom:0;mso-position-horizontal:left;mso-position-horizontal-relative:margin;mso-position-vertical:absolute;mso-position-vertical-relative:text;mso-width-percent:0;mso-width-relative:margin" from="0,2.85pt" to="449.4pt,2.85pt" o:gfxdata="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" strokecolor="#156082 [3204]" strokeweight="1pt">
-              <v:stroke joinstyle="miter"/>
-              <w10:wrap anchorx="margin"/>
-            </v:line>
-          </w:pict>
-        </mc:Fallback>
-      </mc:AlternateContent>
-    </w:r>
   </w:p>
   <w:p>
     <w:pPr>
@@ -1791,7 +1902,23 @@
         <w:b/>
         <w:bCs/>
       </w:rPr>
-      <w:t xml:space="preserve">Berita Acara Serah Terima Surplus </w:t>
+      <w:t xml:space="preserve">Berita Acara Serah </w:t>
+    </w:r>
+    <w:proofErr w:type="spellStart"/>
+    <w:r>
+      <w:rPr>
+        <w:b/>
+        <w:bCs/>
+      </w:rPr>
+      <w:t>Terima</w:t>
+    </w:r>
+    <w:proofErr w:type="spellEnd"/>
+    <w:r>
+      <w:rPr>
+        <w:b/>
+        <w:bCs/>
+      </w:rPr>
+      <w:t xml:space="preserve"> Surplus </w:t>
     </w:r>
     <w:proofErr w:type="spellStart"/>
     <w:r>
@@ -1836,7 +1963,23 @@
         <w:b/>
         <w:bCs/>
       </w:rPr>
-      <w:t xml:space="preserve"> – Berbagi Bites Jogja</w:t>
+      <w:t xml:space="preserve"> – </w:t>
+    </w:r>
+    <w:proofErr w:type="spellStart"/>
+    <w:r>
+      <w:rPr>
+        <w:b/>
+        <w:bCs/>
+      </w:rPr>
+      <w:t>Berbagi</w:t>
+    </w:r>
+    <w:proofErr w:type="spellEnd"/>
+    <w:r>
+      <w:rPr>
+        <w:b/>
+        <w:bCs/>
+      </w:rPr>
+      <w:t xml:space="preserve"> Bites Jogja</w:t>
     </w:r>
   </w:p>
   <w:p>
@@ -3356,6 +3499,7 @@
   <w:style w:type="character" w:default="1" w:styleId="DefaultParagraphFont">
     <w:name w:val="Default Paragraph Font"/>
     <w:uiPriority w:val="1"/>
+    <w:semiHidden/>
     <w:unhideWhenUsed/>
   </w:style>
   <w:style w:type="table" w:default="1" w:styleId="TableNormal">

</xml_diff>